<commit_message>
Add author emails and the project guide to the paper
Co-Authored-By: Claude Opus 5.5 <noreply@anthropic.com>
Claude-Session: https://claude.ai/code/session_016TgQtxgBoXnX5ZRr7h9Jqn
</commit_message>
<xml_diff>
--- a/docs/report/IEEE_Report.docx
+++ b/docs/report/IEEE_Report.docx
@@ -23,13 +23,14 @@
         <w:tblLook w:firstColumn="1" w:firstRow="1" w:lastColumn="0" w:lastRow="0" w:noHBand="0" w:noVBand="1" w:val="04A0"/>
       </w:tblPr>
       <w:tblGrid>
-        <w:gridCol w:w="5220"/>
-        <w:gridCol w:w="5220"/>
+        <w:gridCol w:w="3480"/>
+        <w:gridCol w:w="3480"/>
+        <w:gridCol w:w="3480"/>
       </w:tblGrid>
       <w:tr>
         <w:tc>
           <w:tcPr>
-            <w:tcW w:type="dxa" w:w="5220"/>
+            <w:tcW w:type="dxa" w:w="3480"/>
           </w:tcPr>
           <w:p>
             <w:pPr>
@@ -52,7 +53,7 @@
               <w:rPr>
                 <w:b w:val="0"/>
                 <w:i w:val="0"/>
-                <w:sz w:val="20"/>
+                <w:sz w:val="19"/>
               </w:rPr>
               <w:t>Reg. No. 23BCE1834</w:t>
             </w:r>
@@ -65,7 +66,7 @@
               <w:rPr>
                 <w:b w:val="0"/>
                 <w:i/>
-                <w:sz w:val="20"/>
+                <w:sz w:val="19"/>
               </w:rPr>
               <w:t>School of Computer Science and Engineering</w:t>
             </w:r>
@@ -78,7 +79,7 @@
               <w:rPr>
                 <w:b w:val="0"/>
                 <w:i/>
-                <w:sz w:val="20"/>
+                <w:sz w:val="19"/>
               </w:rPr>
               <w:t>Vellore Institute of Technology</w:t>
             </w:r>
@@ -91,15 +92,28 @@
               <w:rPr>
                 <w:b w:val="0"/>
                 <w:i/>
-                <w:sz w:val="20"/>
+                <w:sz w:val="19"/>
               </w:rPr>
               <w:t>Chennai, India</w:t>
+            </w:r>
+          </w:p>
+          <w:p>
+            <w:pPr>
+              <w:jc w:val="center"/>
+            </w:pPr>
+            <w:r>
+              <w:rPr>
+                <w:b w:val="0"/>
+                <w:i w:val="0"/>
+                <w:sz w:val="18"/>
+              </w:rPr>
+              <w:t>sivakumar.g2023@vitstudent.ac.in</w:t>
             </w:r>
           </w:p>
         </w:tc>
         <w:tc>
           <w:tcPr>
-            <w:tcW w:type="dxa" w:w="5220"/>
+            <w:tcW w:type="dxa" w:w="3480"/>
           </w:tcPr>
           <w:p>
             <w:pPr>
@@ -122,7 +136,7 @@
               <w:rPr>
                 <w:b w:val="0"/>
                 <w:i w:val="0"/>
-                <w:sz w:val="20"/>
+                <w:sz w:val="19"/>
               </w:rPr>
               <w:t>Reg. No. 23BCE1868</w:t>
             </w:r>
@@ -135,7 +149,7 @@
               <w:rPr>
                 <w:b w:val="0"/>
                 <w:i/>
-                <w:sz w:val="20"/>
+                <w:sz w:val="19"/>
               </w:rPr>
               <w:t>School of Computer Science and Engineering</w:t>
             </w:r>
@@ -148,7 +162,7 @@
               <w:rPr>
                 <w:b w:val="0"/>
                 <w:i/>
-                <w:sz w:val="20"/>
+                <w:sz w:val="19"/>
               </w:rPr>
               <w:t>Vellore Institute of Technology</w:t>
             </w:r>
@@ -161,7 +175,90 @@
               <w:rPr>
                 <w:b w:val="0"/>
                 <w:i/>
-                <w:sz w:val="20"/>
+                <w:sz w:val="19"/>
+              </w:rPr>
+              <w:t>Chennai, India</w:t>
+            </w:r>
+          </w:p>
+          <w:p>
+            <w:pPr>
+              <w:jc w:val="center"/>
+            </w:pPr>
+            <w:r>
+              <w:rPr>
+                <w:b w:val="0"/>
+                <w:i w:val="0"/>
+                <w:sz w:val="18"/>
+              </w:rPr>
+              <w:t>afzalahamed.a2023@vitstudent.ac.in</w:t>
+            </w:r>
+          </w:p>
+        </w:tc>
+        <w:tc>
+          <w:tcPr>
+            <w:tcW w:type="dxa" w:w="3480"/>
+          </w:tcPr>
+          <w:p>
+            <w:pPr>
+              <w:jc w:val="center"/>
+            </w:pPr>
+            <w:r>
+              <w:rPr>
+                <w:b w:val="0"/>
+                <w:i w:val="0"/>
+                <w:sz w:val="22"/>
+              </w:rPr>
+              <w:t>Manjula V</w:t>
+            </w:r>
+          </w:p>
+          <w:p>
+            <w:pPr>
+              <w:jc w:val="center"/>
+            </w:pPr>
+            <w:r>
+              <w:rPr>
+                <w:b w:val="0"/>
+                <w:i w:val="0"/>
+                <w:sz w:val="19"/>
+              </w:rPr>
+              <w:t>Associate Professor Senior (Guide)</w:t>
+            </w:r>
+          </w:p>
+          <w:p>
+            <w:pPr>
+              <w:jc w:val="center"/>
+            </w:pPr>
+            <w:r>
+              <w:rPr>
+                <w:b w:val="0"/>
+                <w:i/>
+                <w:sz w:val="19"/>
+              </w:rPr>
+              <w:t>School of Computer Science and Engineering</w:t>
+            </w:r>
+          </w:p>
+          <w:p>
+            <w:pPr>
+              <w:jc w:val="center"/>
+            </w:pPr>
+            <w:r>
+              <w:rPr>
+                <w:b w:val="0"/>
+                <w:i/>
+                <w:sz w:val="19"/>
+              </w:rPr>
+              <w:t>Vellore Institute of Technology</w:t>
+            </w:r>
+          </w:p>
+          <w:p>
+            <w:pPr>
+              <w:jc w:val="center"/>
+            </w:pPr>
+            <w:r>
+              <w:rPr>
+                <w:b w:val="0"/>
+                <w:i/>
+                <w:sz w:val="19"/>
               </w:rPr>
               <w:t>Chennai, India</w:t>
             </w:r>

</xml_diff>

<commit_message>
Add an appendix with the drive folder and repository links to the paper
Co-Authored-By: Claude Opus 5.5 <noreply@anthropic.com>
Claude-Session: https://claude.ai/code/session_016TgQtxgBoXnX5ZRr7h9Jqn
</commit_message>
<xml_diff>
--- a/docs/report/IEEE_Report.docx
+++ b/docs/report/IEEE_Report.docx
@@ -4600,6 +4600,81 @@
         <w:t>[17] Z. Ji et al., “Survey of hallucination in natural language generation,” ACM Computing Surveys, vol. 55, no. 12, 2023.</w:t>
       </w:r>
     </w:p>
+    <w:p>
+      <w:pPr>
+        <w:spacing w:before="200" w:after="80"/>
+        <w:jc w:val="center"/>
+      </w:pPr>
+      <w:r>
+        <w:rPr>
+          <w:b w:val="0"/>
+          <w:i w:val="0"/>
+          <w:smallCaps/>
+        </w:rPr>
+        <w:t>Appendix: Drive Link</w:t>
+      </w:r>
+    </w:p>
+    <w:p>
+      <w:pPr>
+        <w:ind w:firstLine="180"/>
+        <w:jc w:val="both"/>
+      </w:pPr>
+      <w:r>
+        <w:rPr>
+          <w:b w:val="0"/>
+          <w:i w:val="0"/>
+        </w:rPr>
+        <w:t>The project folder contains the complete source code, the demonstration video of the working system from log ingestion to AI incident investigation, and the user manual that explains how to install and run it. The folder is shared so that anyone with the link can view it.</w:t>
+      </w:r>
+    </w:p>
+    <w:p>
+      <w:pPr>
+        <w:spacing w:before="60"/>
+        <w:ind w:left="144"/>
+      </w:pPr>
+      <w:r>
+        <w:rPr>
+          <w:b/>
+          <w:i w:val="0"/>
+          <w:sz w:val="18"/>
+        </w:rPr>
+        <w:t xml:space="preserve">Drive folder (code, demo video, user manual): </w:t>
+      </w:r>
+      <w:hyperlink r:id="rId15">
+        <w:r>
+          <w:rPr>
+            <w:color w:val="0563C1"/>
+            <w:u w:val="single"/>
+            <w:sz w:val="18"/>
+          </w:rPr>
+          <w:t>https://drive.google.com/drive/folders/1YvUnh0IvpU9PN5cbIb2BNfOtxddi_WOl</w:t>
+        </w:r>
+      </w:hyperlink>
+    </w:p>
+    <w:p>
+      <w:pPr>
+        <w:spacing w:before="60"/>
+        <w:ind w:left="144"/>
+      </w:pPr>
+      <w:r>
+        <w:rPr>
+          <w:b/>
+          <w:i w:val="0"/>
+          <w:sz w:val="18"/>
+        </w:rPr>
+        <w:t xml:space="preserve">Source code repository: </w:t>
+      </w:r>
+      <w:hyperlink r:id="rId16">
+        <w:r>
+          <w:rPr>
+            <w:color w:val="0563C1"/>
+            <w:u w:val="single"/>
+            <w:sz w:val="18"/>
+          </w:rPr>
+          <w:t>https://github.com/sivakumar1306/Nosql-finalyear-project</w:t>
+        </w:r>
+      </w:hyperlink>
+    </w:p>
     <w:sectPr>
       <w:type w:val="continuous"/>
       <w:pgSz w:w="12240" w:h="15840"/>

</xml_diff>

<commit_message>
Fit the investigation screenshot in one column and keep tables on one page
The full-width Fig. 6 sat in the middle of the page with its last
timeline row cut off. It is now a complete, narrower capture placed in
one column like the other figures. Table rows are kept together so a
table no longer splits across pages.

Co-Authored-By: Claude Opus 5.5 <noreply@anthropic.com>
Claude-Session: https://claude.ai/code/session_016TgQtxgBoXnX5ZRr7h9Jqn
</commit_message>
<xml_diff>
--- a/docs/report/IEEE_Report.docx
+++ b/docs/report/IEEE_Report.docx
@@ -791,12 +791,16 @@
         <w:gridCol w:w="3600"/>
       </w:tblGrid>
       <w:tr>
+        <w:trPr>
+          <w:cantSplit/>
+        </w:trPr>
         <w:tc>
           <w:tcPr>
             <w:tcW w:type="dxa" w:w="1296"/>
           </w:tcPr>
           <w:p>
             <w:pPr>
+              <w:keepNext/>
               <w:jc w:val="left"/>
             </w:pPr>
             <w:r>
@@ -815,6 +819,7 @@
           </w:tcPr>
           <w:p>
             <w:pPr>
+              <w:keepNext/>
               <w:jc w:val="center"/>
             </w:pPr>
             <w:r>
@@ -829,12 +834,16 @@
         </w:tc>
       </w:tr>
       <w:tr>
+        <w:trPr>
+          <w:cantSplit/>
+        </w:trPr>
         <w:tc>
           <w:tcPr>
             <w:tcW w:type="dxa" w:w="1296"/>
           </w:tcPr>
           <w:p>
             <w:pPr>
+              <w:keepNext/>
               <w:jc w:val="left"/>
             </w:pPr>
             <w:r>
@@ -853,6 +862,7 @@
           </w:tcPr>
           <w:p>
             <w:pPr>
+              <w:keepNext/>
               <w:jc w:val="center"/>
             </w:pPr>
             <w:r>
@@ -867,12 +877,16 @@
         </w:tc>
       </w:tr>
       <w:tr>
+        <w:trPr>
+          <w:cantSplit/>
+        </w:trPr>
         <w:tc>
           <w:tcPr>
             <w:tcW w:type="dxa" w:w="1296"/>
           </w:tcPr>
           <w:p>
             <w:pPr>
+              <w:keepNext/>
               <w:jc w:val="left"/>
             </w:pPr>
             <w:r>
@@ -891,6 +905,7 @@
           </w:tcPr>
           <w:p>
             <w:pPr>
+              <w:keepNext/>
               <w:jc w:val="center"/>
             </w:pPr>
             <w:r>
@@ -905,12 +920,16 @@
         </w:tc>
       </w:tr>
       <w:tr>
+        <w:trPr>
+          <w:cantSplit/>
+        </w:trPr>
         <w:tc>
           <w:tcPr>
             <w:tcW w:type="dxa" w:w="1296"/>
           </w:tcPr>
           <w:p>
             <w:pPr>
+              <w:keepNext/>
               <w:jc w:val="left"/>
             </w:pPr>
             <w:r>
@@ -929,6 +948,7 @@
           </w:tcPr>
           <w:p>
             <w:pPr>
+              <w:keepNext/>
               <w:jc w:val="center"/>
             </w:pPr>
             <w:r>
@@ -943,12 +963,16 @@
         </w:tc>
       </w:tr>
       <w:tr>
+        <w:trPr>
+          <w:cantSplit/>
+        </w:trPr>
         <w:tc>
           <w:tcPr>
             <w:tcW w:type="dxa" w:w="1296"/>
           </w:tcPr>
           <w:p>
             <w:pPr>
+              <w:keepNext/>
               <w:jc w:val="left"/>
             </w:pPr>
             <w:r>
@@ -967,6 +991,7 @@
           </w:tcPr>
           <w:p>
             <w:pPr>
+              <w:keepNext/>
               <w:jc w:val="center"/>
             </w:pPr>
             <w:r>
@@ -981,12 +1006,16 @@
         </w:tc>
       </w:tr>
       <w:tr>
+        <w:trPr>
+          <w:cantSplit/>
+        </w:trPr>
         <w:tc>
           <w:tcPr>
             <w:tcW w:type="dxa" w:w="1296"/>
           </w:tcPr>
           <w:p>
             <w:pPr>
+              <w:keepNext/>
               <w:jc w:val="left"/>
             </w:pPr>
             <w:r>
@@ -1005,6 +1034,7 @@
           </w:tcPr>
           <w:p>
             <w:pPr>
+              <w:keepNext/>
               <w:jc w:val="center"/>
             </w:pPr>
             <w:r>
@@ -1019,6 +1049,9 @@
         </w:tc>
       </w:tr>
       <w:tr>
+        <w:trPr>
+          <w:cantSplit/>
+        </w:trPr>
         <w:tc>
           <w:tcPr>
             <w:tcW w:type="dxa" w:w="1296"/>
@@ -1138,12 +1171,16 @@
         <w:gridCol w:w="864"/>
       </w:tblGrid>
       <w:tr>
+        <w:trPr>
+          <w:cantSplit/>
+        </w:trPr>
         <w:tc>
           <w:tcPr>
             <w:tcW w:type="dxa" w:w="1944"/>
           </w:tcPr>
           <w:p>
             <w:pPr>
+              <w:keepNext/>
               <w:jc w:val="left"/>
             </w:pPr>
             <w:r>
@@ -1162,6 +1199,7 @@
           </w:tcPr>
           <w:p>
             <w:pPr>
+              <w:keepNext/>
               <w:jc w:val="center"/>
             </w:pPr>
             <w:r>
@@ -1180,6 +1218,7 @@
           </w:tcPr>
           <w:p>
             <w:pPr>
+              <w:keepNext/>
               <w:jc w:val="center"/>
             </w:pPr>
             <w:r>
@@ -1194,12 +1233,16 @@
         </w:tc>
       </w:tr>
       <w:tr>
+        <w:trPr>
+          <w:cantSplit/>
+        </w:trPr>
         <w:tc>
           <w:tcPr>
             <w:tcW w:type="dxa" w:w="1944"/>
           </w:tcPr>
           <w:p>
             <w:pPr>
+              <w:keepNext/>
               <w:jc w:val="left"/>
             </w:pPr>
             <w:r>
@@ -1218,6 +1261,7 @@
           </w:tcPr>
           <w:p>
             <w:pPr>
+              <w:keepNext/>
               <w:jc w:val="center"/>
             </w:pPr>
             <w:r>
@@ -1236,6 +1280,7 @@
           </w:tcPr>
           <w:p>
             <w:pPr>
+              <w:keepNext/>
               <w:jc w:val="center"/>
             </w:pPr>
             <w:r>
@@ -1250,12 +1295,16 @@
         </w:tc>
       </w:tr>
       <w:tr>
+        <w:trPr>
+          <w:cantSplit/>
+        </w:trPr>
         <w:tc>
           <w:tcPr>
             <w:tcW w:type="dxa" w:w="1944"/>
           </w:tcPr>
           <w:p>
             <w:pPr>
+              <w:keepNext/>
               <w:jc w:val="left"/>
             </w:pPr>
             <w:r>
@@ -1274,6 +1323,7 @@
           </w:tcPr>
           <w:p>
             <w:pPr>
+              <w:keepNext/>
               <w:jc w:val="center"/>
             </w:pPr>
             <w:r>
@@ -1292,6 +1342,7 @@
           </w:tcPr>
           <w:p>
             <w:pPr>
+              <w:keepNext/>
               <w:jc w:val="center"/>
             </w:pPr>
             <w:r>
@@ -1306,12 +1357,16 @@
         </w:tc>
       </w:tr>
       <w:tr>
+        <w:trPr>
+          <w:cantSplit/>
+        </w:trPr>
         <w:tc>
           <w:tcPr>
             <w:tcW w:type="dxa" w:w="1944"/>
           </w:tcPr>
           <w:p>
             <w:pPr>
+              <w:keepNext/>
               <w:jc w:val="left"/>
             </w:pPr>
             <w:r>
@@ -1330,6 +1385,7 @@
           </w:tcPr>
           <w:p>
             <w:pPr>
+              <w:keepNext/>
               <w:jc w:val="center"/>
             </w:pPr>
             <w:r>
@@ -1348,6 +1404,7 @@
           </w:tcPr>
           <w:p>
             <w:pPr>
+              <w:keepNext/>
               <w:jc w:val="center"/>
             </w:pPr>
             <w:r>
@@ -1362,12 +1419,16 @@
         </w:tc>
       </w:tr>
       <w:tr>
+        <w:trPr>
+          <w:cantSplit/>
+        </w:trPr>
         <w:tc>
           <w:tcPr>
             <w:tcW w:type="dxa" w:w="1944"/>
           </w:tcPr>
           <w:p>
             <w:pPr>
+              <w:keepNext/>
               <w:jc w:val="left"/>
             </w:pPr>
             <w:r>
@@ -1386,6 +1447,7 @@
           </w:tcPr>
           <w:p>
             <w:pPr>
+              <w:keepNext/>
               <w:jc w:val="center"/>
             </w:pPr>
             <w:r>
@@ -1404,6 +1466,7 @@
           </w:tcPr>
           <w:p>
             <w:pPr>
+              <w:keepNext/>
               <w:jc w:val="center"/>
             </w:pPr>
             <w:r>
@@ -1418,12 +1481,16 @@
         </w:tc>
       </w:tr>
       <w:tr>
+        <w:trPr>
+          <w:cantSplit/>
+        </w:trPr>
         <w:tc>
           <w:tcPr>
             <w:tcW w:type="dxa" w:w="1944"/>
           </w:tcPr>
           <w:p>
             <w:pPr>
+              <w:keepNext/>
               <w:jc w:val="left"/>
             </w:pPr>
             <w:r>
@@ -1442,6 +1509,7 @@
           </w:tcPr>
           <w:p>
             <w:pPr>
+              <w:keepNext/>
               <w:jc w:val="center"/>
             </w:pPr>
             <w:r>
@@ -1460,6 +1528,7 @@
           </w:tcPr>
           <w:p>
             <w:pPr>
+              <w:keepNext/>
               <w:jc w:val="center"/>
             </w:pPr>
             <w:r>
@@ -1474,12 +1543,16 @@
         </w:tc>
       </w:tr>
       <w:tr>
+        <w:trPr>
+          <w:cantSplit/>
+        </w:trPr>
         <w:tc>
           <w:tcPr>
             <w:tcW w:type="dxa" w:w="1944"/>
           </w:tcPr>
           <w:p>
             <w:pPr>
+              <w:keepNext/>
               <w:jc w:val="left"/>
             </w:pPr>
             <w:r>
@@ -1498,6 +1571,7 @@
           </w:tcPr>
           <w:p>
             <w:pPr>
+              <w:keepNext/>
               <w:jc w:val="center"/>
             </w:pPr>
             <w:r>
@@ -1516,6 +1590,7 @@
           </w:tcPr>
           <w:p>
             <w:pPr>
+              <w:keepNext/>
               <w:jc w:val="center"/>
             </w:pPr>
             <w:r>
@@ -1530,6 +1605,9 @@
         </w:tc>
       </w:tr>
       <w:tr>
+        <w:trPr>
+          <w:cantSplit/>
+        </w:trPr>
         <w:tc>
           <w:tcPr>
             <w:tcW w:type="dxa" w:w="1944"/>
@@ -2546,12 +2624,16 @@
         <w:gridCol w:w="605"/>
       </w:tblGrid>
       <w:tr>
+        <w:trPr>
+          <w:cantSplit/>
+        </w:trPr>
         <w:tc>
           <w:tcPr>
             <w:tcW w:type="dxa" w:w="1368"/>
           </w:tcPr>
           <w:p>
             <w:pPr>
+              <w:keepNext/>
               <w:jc w:val="left"/>
             </w:pPr>
             <w:r>
@@ -2570,6 +2652,7 @@
           </w:tcPr>
           <w:p>
             <w:pPr>
+              <w:keepNext/>
               <w:jc w:val="center"/>
             </w:pPr>
             <w:r>
@@ -2588,6 +2671,7 @@
           </w:tcPr>
           <w:p>
             <w:pPr>
+              <w:keepNext/>
               <w:jc w:val="center"/>
             </w:pPr>
             <w:r>
@@ -2606,6 +2690,7 @@
           </w:tcPr>
           <w:p>
             <w:pPr>
+              <w:keepNext/>
               <w:jc w:val="center"/>
             </w:pPr>
             <w:r>
@@ -2624,6 +2709,7 @@
           </w:tcPr>
           <w:p>
             <w:pPr>
+              <w:keepNext/>
               <w:jc w:val="center"/>
             </w:pPr>
             <w:r>
@@ -2642,6 +2728,7 @@
           </w:tcPr>
           <w:p>
             <w:pPr>
+              <w:keepNext/>
               <w:jc w:val="center"/>
             </w:pPr>
             <w:r>
@@ -2660,6 +2747,7 @@
           </w:tcPr>
           <w:p>
             <w:pPr>
+              <w:keepNext/>
               <w:jc w:val="center"/>
             </w:pPr>
             <w:r>
@@ -2674,12 +2762,16 @@
         </w:tc>
       </w:tr>
       <w:tr>
+        <w:trPr>
+          <w:cantSplit/>
+        </w:trPr>
         <w:tc>
           <w:tcPr>
             <w:tcW w:type="dxa" w:w="1368"/>
           </w:tcPr>
           <w:p>
             <w:pPr>
+              <w:keepNext/>
               <w:jc w:val="left"/>
             </w:pPr>
             <w:r>
@@ -2698,6 +2790,7 @@
           </w:tcPr>
           <w:p>
             <w:pPr>
+              <w:keepNext/>
               <w:jc w:val="center"/>
             </w:pPr>
             <w:r>
@@ -2716,6 +2809,7 @@
           </w:tcPr>
           <w:p>
             <w:pPr>
+              <w:keepNext/>
               <w:jc w:val="center"/>
             </w:pPr>
             <w:r>
@@ -2734,6 +2828,7 @@
           </w:tcPr>
           <w:p>
             <w:pPr>
+              <w:keepNext/>
               <w:jc w:val="center"/>
             </w:pPr>
             <w:r>
@@ -2752,6 +2847,7 @@
           </w:tcPr>
           <w:p>
             <w:pPr>
+              <w:keepNext/>
               <w:jc w:val="center"/>
             </w:pPr>
             <w:r>
@@ -2770,6 +2866,7 @@
           </w:tcPr>
           <w:p>
             <w:pPr>
+              <w:keepNext/>
               <w:jc w:val="center"/>
             </w:pPr>
             <w:r>
@@ -2788,6 +2885,7 @@
           </w:tcPr>
           <w:p>
             <w:pPr>
+              <w:keepNext/>
               <w:jc w:val="center"/>
             </w:pPr>
             <w:r>
@@ -2802,12 +2900,16 @@
         </w:tc>
       </w:tr>
       <w:tr>
+        <w:trPr>
+          <w:cantSplit/>
+        </w:trPr>
         <w:tc>
           <w:tcPr>
             <w:tcW w:type="dxa" w:w="1368"/>
           </w:tcPr>
           <w:p>
             <w:pPr>
+              <w:keepNext/>
               <w:jc w:val="left"/>
             </w:pPr>
             <w:r>
@@ -2826,6 +2928,7 @@
           </w:tcPr>
           <w:p>
             <w:pPr>
+              <w:keepNext/>
               <w:jc w:val="center"/>
             </w:pPr>
             <w:r>
@@ -2844,6 +2947,7 @@
           </w:tcPr>
           <w:p>
             <w:pPr>
+              <w:keepNext/>
               <w:jc w:val="center"/>
             </w:pPr>
             <w:r>
@@ -2862,6 +2966,7 @@
           </w:tcPr>
           <w:p>
             <w:pPr>
+              <w:keepNext/>
               <w:jc w:val="center"/>
             </w:pPr>
             <w:r>
@@ -2880,6 +2985,7 @@
           </w:tcPr>
           <w:p>
             <w:pPr>
+              <w:keepNext/>
               <w:jc w:val="center"/>
             </w:pPr>
             <w:r>
@@ -2898,6 +3004,7 @@
           </w:tcPr>
           <w:p>
             <w:pPr>
+              <w:keepNext/>
               <w:jc w:val="center"/>
             </w:pPr>
             <w:r>
@@ -2916,6 +3023,7 @@
           </w:tcPr>
           <w:p>
             <w:pPr>
+              <w:keepNext/>
               <w:jc w:val="center"/>
             </w:pPr>
             <w:r>
@@ -2930,12 +3038,16 @@
         </w:tc>
       </w:tr>
       <w:tr>
+        <w:trPr>
+          <w:cantSplit/>
+        </w:trPr>
         <w:tc>
           <w:tcPr>
             <w:tcW w:type="dxa" w:w="1368"/>
           </w:tcPr>
           <w:p>
             <w:pPr>
+              <w:keepNext/>
               <w:jc w:val="left"/>
             </w:pPr>
             <w:r>
@@ -2954,6 +3066,7 @@
           </w:tcPr>
           <w:p>
             <w:pPr>
+              <w:keepNext/>
               <w:jc w:val="center"/>
             </w:pPr>
             <w:r>
@@ -2972,6 +3085,7 @@
           </w:tcPr>
           <w:p>
             <w:pPr>
+              <w:keepNext/>
               <w:jc w:val="center"/>
             </w:pPr>
             <w:r>
@@ -2990,6 +3104,7 @@
           </w:tcPr>
           <w:p>
             <w:pPr>
+              <w:keepNext/>
               <w:jc w:val="center"/>
             </w:pPr>
             <w:r>
@@ -3008,6 +3123,7 @@
           </w:tcPr>
           <w:p>
             <w:pPr>
+              <w:keepNext/>
               <w:jc w:val="center"/>
             </w:pPr>
             <w:r>
@@ -3026,6 +3142,7 @@
           </w:tcPr>
           <w:p>
             <w:pPr>
+              <w:keepNext/>
               <w:jc w:val="center"/>
             </w:pPr>
             <w:r>
@@ -3044,6 +3161,7 @@
           </w:tcPr>
           <w:p>
             <w:pPr>
+              <w:keepNext/>
               <w:jc w:val="center"/>
             </w:pPr>
             <w:r>
@@ -3058,12 +3176,16 @@
         </w:tc>
       </w:tr>
       <w:tr>
+        <w:trPr>
+          <w:cantSplit/>
+        </w:trPr>
         <w:tc>
           <w:tcPr>
             <w:tcW w:type="dxa" w:w="1368"/>
           </w:tcPr>
           <w:p>
             <w:pPr>
+              <w:keepNext/>
               <w:jc w:val="left"/>
             </w:pPr>
             <w:r>
@@ -3082,6 +3204,7 @@
           </w:tcPr>
           <w:p>
             <w:pPr>
+              <w:keepNext/>
               <w:jc w:val="center"/>
             </w:pPr>
             <w:r>
@@ -3100,6 +3223,7 @@
           </w:tcPr>
           <w:p>
             <w:pPr>
+              <w:keepNext/>
               <w:jc w:val="center"/>
             </w:pPr>
             <w:r>
@@ -3118,6 +3242,7 @@
           </w:tcPr>
           <w:p>
             <w:pPr>
+              <w:keepNext/>
               <w:jc w:val="center"/>
             </w:pPr>
             <w:r>
@@ -3136,6 +3261,7 @@
           </w:tcPr>
           <w:p>
             <w:pPr>
+              <w:keepNext/>
               <w:jc w:val="center"/>
             </w:pPr>
             <w:r>
@@ -3154,6 +3280,7 @@
           </w:tcPr>
           <w:p>
             <w:pPr>
+              <w:keepNext/>
               <w:jc w:val="center"/>
             </w:pPr>
             <w:r>
@@ -3172,6 +3299,7 @@
           </w:tcPr>
           <w:p>
             <w:pPr>
+              <w:keepNext/>
               <w:jc w:val="center"/>
             </w:pPr>
             <w:r>
@@ -3186,12 +3314,16 @@
         </w:tc>
       </w:tr>
       <w:tr>
+        <w:trPr>
+          <w:cantSplit/>
+        </w:trPr>
         <w:tc>
           <w:tcPr>
             <w:tcW w:type="dxa" w:w="1368"/>
           </w:tcPr>
           <w:p>
             <w:pPr>
+              <w:keepNext/>
               <w:jc w:val="left"/>
             </w:pPr>
             <w:r>
@@ -3210,6 +3342,7 @@
           </w:tcPr>
           <w:p>
             <w:pPr>
+              <w:keepNext/>
               <w:jc w:val="center"/>
             </w:pPr>
             <w:r>
@@ -3228,6 +3361,7 @@
           </w:tcPr>
           <w:p>
             <w:pPr>
+              <w:keepNext/>
               <w:jc w:val="center"/>
             </w:pPr>
             <w:r>
@@ -3246,6 +3380,7 @@
           </w:tcPr>
           <w:p>
             <w:pPr>
+              <w:keepNext/>
               <w:jc w:val="center"/>
             </w:pPr>
             <w:r>
@@ -3264,6 +3399,7 @@
           </w:tcPr>
           <w:p>
             <w:pPr>
+              <w:keepNext/>
               <w:jc w:val="center"/>
             </w:pPr>
             <w:r>
@@ -3282,6 +3418,7 @@
           </w:tcPr>
           <w:p>
             <w:pPr>
+              <w:keepNext/>
               <w:jc w:val="center"/>
             </w:pPr>
             <w:r>
@@ -3300,6 +3437,7 @@
           </w:tcPr>
           <w:p>
             <w:pPr>
+              <w:keepNext/>
               <w:jc w:val="center"/>
             </w:pPr>
             <w:r>
@@ -3314,6 +3452,9 @@
         </w:tc>
       </w:tr>
       <w:tr>
+        <w:trPr>
+          <w:cantSplit/>
+        </w:trPr>
         <w:tc>
           <w:tcPr>
             <w:tcW w:type="dxa" w:w="1368"/>
@@ -3600,12 +3741,16 @@
         <w:gridCol w:w="1152"/>
       </w:tblGrid>
       <w:tr>
+        <w:trPr>
+          <w:cantSplit/>
+        </w:trPr>
         <w:tc>
           <w:tcPr>
             <w:tcW w:type="dxa" w:w="1584"/>
           </w:tcPr>
           <w:p>
             <w:pPr>
+              <w:keepNext/>
               <w:jc w:val="left"/>
             </w:pPr>
             <w:r>
@@ -3624,6 +3769,7 @@
           </w:tcPr>
           <w:p>
             <w:pPr>
+              <w:keepNext/>
               <w:jc w:val="center"/>
             </w:pPr>
             <w:r>
@@ -3642,6 +3788,7 @@
           </w:tcPr>
           <w:p>
             <w:pPr>
+              <w:keepNext/>
               <w:jc w:val="center"/>
             </w:pPr>
             <w:r>
@@ -3660,6 +3807,7 @@
           </w:tcPr>
           <w:p>
             <w:pPr>
+              <w:keepNext/>
               <w:jc w:val="center"/>
             </w:pPr>
             <w:r>
@@ -3674,12 +3822,16 @@
         </w:tc>
       </w:tr>
       <w:tr>
+        <w:trPr>
+          <w:cantSplit/>
+        </w:trPr>
         <w:tc>
           <w:tcPr>
             <w:tcW w:type="dxa" w:w="1584"/>
           </w:tcPr>
           <w:p>
             <w:pPr>
+              <w:keepNext/>
               <w:jc w:val="left"/>
             </w:pPr>
             <w:r>
@@ -3698,6 +3850,7 @@
           </w:tcPr>
           <w:p>
             <w:pPr>
+              <w:keepNext/>
               <w:jc w:val="center"/>
             </w:pPr>
             <w:r>
@@ -3716,6 +3869,7 @@
           </w:tcPr>
           <w:p>
             <w:pPr>
+              <w:keepNext/>
               <w:jc w:val="center"/>
             </w:pPr>
             <w:r>
@@ -3734,6 +3888,7 @@
           </w:tcPr>
           <w:p>
             <w:pPr>
+              <w:keepNext/>
               <w:jc w:val="center"/>
             </w:pPr>
             <w:r>
@@ -3748,12 +3903,16 @@
         </w:tc>
       </w:tr>
       <w:tr>
+        <w:trPr>
+          <w:cantSplit/>
+        </w:trPr>
         <w:tc>
           <w:tcPr>
             <w:tcW w:type="dxa" w:w="1584"/>
           </w:tcPr>
           <w:p>
             <w:pPr>
+              <w:keepNext/>
               <w:jc w:val="left"/>
             </w:pPr>
             <w:r>
@@ -3772,6 +3931,7 @@
           </w:tcPr>
           <w:p>
             <w:pPr>
+              <w:keepNext/>
               <w:jc w:val="center"/>
             </w:pPr>
             <w:r>
@@ -3790,6 +3950,7 @@
           </w:tcPr>
           <w:p>
             <w:pPr>
+              <w:keepNext/>
               <w:jc w:val="center"/>
             </w:pPr>
             <w:r>
@@ -3808,6 +3969,7 @@
           </w:tcPr>
           <w:p>
             <w:pPr>
+              <w:keepNext/>
               <w:jc w:val="center"/>
             </w:pPr>
             <w:r>
@@ -3822,12 +3984,16 @@
         </w:tc>
       </w:tr>
       <w:tr>
+        <w:trPr>
+          <w:cantSplit/>
+        </w:trPr>
         <w:tc>
           <w:tcPr>
             <w:tcW w:type="dxa" w:w="1584"/>
           </w:tcPr>
           <w:p>
             <w:pPr>
+              <w:keepNext/>
               <w:jc w:val="left"/>
             </w:pPr>
             <w:r>
@@ -3846,6 +4012,7 @@
           </w:tcPr>
           <w:p>
             <w:pPr>
+              <w:keepNext/>
               <w:jc w:val="center"/>
             </w:pPr>
             <w:r>
@@ -3864,6 +4031,7 @@
           </w:tcPr>
           <w:p>
             <w:pPr>
+              <w:keepNext/>
               <w:jc w:val="center"/>
             </w:pPr>
             <w:r>
@@ -3882,6 +4050,7 @@
           </w:tcPr>
           <w:p>
             <w:pPr>
+              <w:keepNext/>
               <w:jc w:val="center"/>
             </w:pPr>
             <w:r>
@@ -3896,12 +4065,16 @@
         </w:tc>
       </w:tr>
       <w:tr>
+        <w:trPr>
+          <w:cantSplit/>
+        </w:trPr>
         <w:tc>
           <w:tcPr>
             <w:tcW w:type="dxa" w:w="1584"/>
           </w:tcPr>
           <w:p>
             <w:pPr>
+              <w:keepNext/>
               <w:jc w:val="left"/>
             </w:pPr>
             <w:r>
@@ -3920,6 +4093,7 @@
           </w:tcPr>
           <w:p>
             <w:pPr>
+              <w:keepNext/>
               <w:jc w:val="center"/>
             </w:pPr>
             <w:r>
@@ -3938,6 +4112,7 @@
           </w:tcPr>
           <w:p>
             <w:pPr>
+              <w:keepNext/>
               <w:jc w:val="center"/>
             </w:pPr>
             <w:r>
@@ -3956,6 +4131,7 @@
           </w:tcPr>
           <w:p>
             <w:pPr>
+              <w:keepNext/>
               <w:jc w:val="center"/>
             </w:pPr>
             <w:r>
@@ -3970,6 +4146,9 @@
         </w:tc>
       </w:tr>
       <w:tr>
+        <w:trPr>
+          <w:cantSplit/>
+        </w:trPr>
         <w:tc>
           <w:tcPr>
             <w:tcW w:type="dxa" w:w="1584"/>
@@ -4179,17 +4358,6 @@
     </w:p>
     <w:p>
       <w:pPr>
-        <w:sectPr>
-          <w:type w:val="continuous"/>
-          <w:pgSz w:w="12240" w:h="15840"/>
-          <w:pgMar w:top="1080" w:right="900" w:bottom="1440" w:left="900" w:header="720" w:footer="720" w:gutter="0"/>
-          <w:cols w:space="360" w:num="2"/>
-          <w:docGrid w:linePitch="360"/>
-        </w:sectPr>
-      </w:pPr>
-    </w:p>
-    <w:p>
-      <w:pPr>
         <w:keepNext/>
         <w:spacing w:before="120"/>
         <w:jc w:val="center"/>
@@ -4197,7 +4365,7 @@
       <w:r>
         <w:drawing>
           <wp:inline xmlns:a="http://schemas.openxmlformats.org/drawingml/2006/main" xmlns:pic="http://schemas.openxmlformats.org/drawingml/2006/picture">
-            <wp:extent cx="6035040" cy="3844823"/>
+            <wp:extent cx="3154680" cy="4782022"/>
             <wp:docPr id="6" name="Picture 6"/>
             <wp:cNvGraphicFramePr>
               <a:graphicFrameLocks noChangeAspect="1"/>
@@ -4218,7 +4386,7 @@
                   <pic:spPr>
                     <a:xfrm>
                       <a:off x="0" y="0"/>
-                      <a:ext cx="6035040" cy="3844823"/>
+                      <a:ext cx="3154680" cy="4782022"/>
                     </a:xfrm>
                     <a:prstGeom prst="rect"/>
                   </pic:spPr>
@@ -4250,17 +4418,6 @@
         </w:rPr>
         <w:t>Incident investigation of a simulated cascading failure: ranked root-cause hypotheses with evidence identifiers and the reconstructed timeline.</w:t>
       </w:r>
-    </w:p>
-    <w:p>
-      <w:pPr>
-        <w:sectPr>
-          <w:type w:val="continuous"/>
-          <w:pgSz w:w="12240" w:h="15840"/>
-          <w:pgMar w:top="1080" w:right="900" w:bottom="1440" w:left="900" w:header="720" w:footer="720" w:gutter="0"/>
-          <w:cols w:space="360" w:num="1"/>
-          <w:docGrid w:linePitch="360"/>
-        </w:sectPr>
-      </w:pPr>
     </w:p>
     <w:p>
       <w:pPr>

</xml_diff>